<commit_message>
Added excel 1 and excel 2
</commit_message>
<xml_diff>
--- a/S26/MIS_301H/assignments/excel-1/Assignment1_Dawson_Zhang.docx
+++ b/S26/MIS_301H/assignments/excel-1/Assignment1_Dawson_Zhang.docx
@@ -647,15 +647,15 @@
           <w:bCs w:val="1"/>
           <w:rtl w:val="0"/>
         </w:rPr>
-        <w:t xml:space="preserve">+</w:t>
-      </w:r>
-      <w:r>
-        <w:rPr>
-          <w:b w:val="1"/>
-          <w:bCs w:val="1"/>
-          <w:rtl w:val="0"/>
-        </w:rPr>
-        <w:t xml:space="preserve">229.51%</w:t>
+        <w:t xml:space="preserve">+334.17</w:t>
+      </w:r>
+      <w:r>
+        <w:rPr>
+          <w:b w:val="1"/>
+          <w:bCs w:val="1"/>
+          <w:rtl w:val="0"/>
+        </w:rPr>
+        <w:t xml:space="preserve">%</w:t>
       </w:r>
     </w:p>
     <w:p>
@@ -728,15 +728,15 @@
           <w:bCs w:val="1"/>
           <w:rtl w:val="0"/>
         </w:rPr>
-        <w:t xml:space="preserve">+</w:t>
-      </w:r>
-      <w:r>
-        <w:rPr>
-          <w:b w:val="1"/>
-          <w:bCs w:val="1"/>
-          <w:rtl w:val="0"/>
-        </w:rPr>
-        <w:t xml:space="preserve">180.09%</w:t>
+        <w:t xml:space="preserve">+284.05</w:t>
+      </w:r>
+      <w:r>
+        <w:rPr>
+          <w:b w:val="1"/>
+          <w:bCs w:val="1"/>
+          <w:rtl w:val="0"/>
+        </w:rPr>
+        <w:t xml:space="preserve">%</w:t>
       </w:r>
       <w:r>
         <w:rPr>
@@ -1003,7 +1003,7 @@
           <w:bCs w:val="1"/>
           <w:rtl w:val="0"/>
         </w:rPr>
-        <w:t xml:space="preserve">+229.51%</w:t>
+        <w:t xml:space="preserve">+334.17%</w:t>
       </w:r>
       <w:r>
         <w:rPr>
@@ -1017,7 +1017,7 @@
           <w:bCs w:val="1"/>
           <w:rtl w:val="0"/>
         </w:rPr>
-        <w:t xml:space="preserve">+180.09%</w:t>
+        <w:t xml:space="preserve">+284.05%</w:t>
       </w:r>
       <w:r>
         <w:rPr>
@@ -1042,7 +1042,7 @@
           <w:bCs w:val="1"/>
           <w:rtl w:val="0"/>
         </w:rPr>
-        <w:t xml:space="preserve">+93.65%</w:t>
+        <w:t xml:space="preserve">+80.21%</w:t>
       </w:r>
       <w:r>
         <w:rPr>
@@ -1056,7 +1056,7 @@
           <w:bCs w:val="1"/>
           <w:rtl w:val="0"/>
         </w:rPr>
-        <w:t xml:space="preserve">+79.60%</w:t>
+        <w:t xml:space="preserve">+68.18%</w:t>
       </w:r>
       <w:r>
         <w:rPr>
@@ -1081,7 +1081,7 @@
           <w:bCs w:val="1"/>
           <w:rtl w:val="0"/>
         </w:rPr>
-        <w:t xml:space="preserve">+79.61%</w:t>
+        <w:t xml:space="preserve">+92.05%</w:t>
       </w:r>
       <w:r>
         <w:rPr>
@@ -1095,7 +1095,7 @@
           <w:bCs w:val="1"/>
           <w:rtl w:val="0"/>
         </w:rPr>
-        <w:t xml:space="preserve">+67.67%</w:t>
+        <w:t xml:space="preserve">+78.25%</w:t>
       </w:r>
       <w:r>
         <w:rPr>
@@ -1120,7 +1120,7 @@
           <w:bCs w:val="1"/>
           <w:rtl w:val="0"/>
         </w:rPr>
-        <w:t xml:space="preserve">+58.45%</w:t>
+        <w:t xml:space="preserve">+56.85%</w:t>
       </w:r>
       <w:r>
         <w:rPr>
@@ -1134,7 +1134,7 @@
           <w:bCs w:val="1"/>
           <w:rtl w:val="0"/>
         </w:rPr>
-        <w:t xml:space="preserve">+49.68%</w:t>
+        <w:t xml:space="preserve">+48.32%</w:t>
       </w:r>
       <w:r>
         <w:rPr>
@@ -1159,7 +1159,7 @@
           <w:bCs w:val="1"/>
           <w:rtl w:val="0"/>
         </w:rPr>
-        <w:t xml:space="preserve">+48.62%</w:t>
+        <w:t xml:space="preserve">+46.52%</w:t>
       </w:r>
       <w:r>
         <w:rPr>
@@ -1173,7 +1173,7 @@
           <w:bCs w:val="1"/>
           <w:rtl w:val="0"/>
         </w:rPr>
-        <w:t xml:space="preserve">+41.33%</w:t>
+        <w:t xml:space="preserve">+39.54%</w:t>
       </w:r>
       <w:r>
         <w:rPr>

</xml_diff>